<commit_message>
Knowledge - 3-Work knowledge - 1/18/2026
</commit_message>
<xml_diff>
--- a/Knowledge/3-Work knowledge/1-Software Engineering/2-Web Full Stack/1-World Wide Web/5-My Source/1-Network and Computer Network.docx
+++ b/Knowledge/3-Work knowledge/1-Software Engineering/2-Web Full Stack/1-World Wide Web/5-My Source/1-Network and Computer Network.docx
@@ -52,7 +52,7 @@
       <w:bookmarkStart w:id="0" w:name="_Hlk216170284"/>
       <w:r>
         <w:rPr>
-          <w:rFonts w:ascii="Arial" w:hAnsi="Arial" w:eastAsia="Arial"/>
+          <w:rFonts w:ascii="Arial" w:eastAsia="Arial" w:hAnsi="Arial"/>
           <w:b/>
           <w:sz w:val="22"/>
           <w:shd w:val="clear" w:color="auto" w:fill="B7B7B7"/>
@@ -61,7 +61,7 @@
       </w:r>
       <w:r>
         <w:rPr>
-          <w:rFonts w:ascii="Arial" w:hAnsi="Arial" w:eastAsia="Arial"/>
+          <w:rFonts w:ascii="Arial" w:eastAsia="Arial" w:hAnsi="Arial"/>
           <w:sz w:val="22"/>
           <w:shd w:val="clear" w:color="auto" w:fill="B7B7B7"/>
         </w:rPr>
@@ -70,7 +70,7 @@
       <w:proofErr w:type="spellStart"/>
       <w:r>
         <w:rPr>
-          <w:rFonts w:ascii="Arial" w:hAnsi="Arial" w:eastAsia="Arial"/>
+          <w:rFonts w:ascii="Arial" w:eastAsia="Arial" w:hAnsi="Arial"/>
           <w:b/>
           <w:sz w:val="22"/>
           <w:shd w:val="clear" w:color="auto" w:fill="B7B7B7"/>
@@ -80,7 +80,7 @@
       <w:proofErr w:type="spellEnd"/>
       <w:r>
         <w:rPr>
-          <w:rFonts w:ascii="Arial" w:hAnsi="Arial" w:eastAsia="Arial"/>
+          <w:rFonts w:ascii="Arial" w:eastAsia="Arial" w:hAnsi="Arial"/>
           <w:b/>
           <w:sz w:val="22"/>
           <w:shd w:val="clear" w:color="auto" w:fill="B7B7B7"/>
@@ -89,7 +89,7 @@
       </w:r>
       <w:r>
         <w:rPr>
-          <w:rFonts w:ascii="Arial" w:hAnsi="Arial" w:eastAsia="Arial"/>
+          <w:rFonts w:ascii="Arial" w:eastAsia="Arial" w:hAnsi="Arial"/>
           <w:b/>
           <w:sz w:val="22"/>
           <w:szCs w:val="14"/>
@@ -99,7 +99,7 @@
       </w:r>
       <w:r>
         <w:rPr>
-          <w:rFonts w:ascii="Arial" w:hAnsi="Arial" w:cs="Cambria Math" w:eastAsia="Arial"/>
+          <w:rFonts w:ascii="Arial" w:eastAsia="Arial" w:hAnsi="Arial" w:cs="Cambria Math"/>
           <w:b/>
           <w:sz w:val="22"/>
           <w:szCs w:val="14"/>
@@ -109,7 +109,7 @@
       </w:r>
       <w:r>
         <w:rPr>
-          <w:rFonts w:ascii="Arial" w:hAnsi="Arial" w:eastAsia="Arial"/>
+          <w:rFonts w:ascii="Arial" w:eastAsia="Arial" w:hAnsi="Arial"/>
           <w:b/>
           <w:sz w:val="22"/>
           <w:szCs w:val="14"/>
@@ -119,7 +119,7 @@
       </w:r>
       <w:r>
         <w:rPr>
-          <w:rFonts w:ascii="Arial" w:hAnsi="Arial" w:eastAsia="Arial"/>
+          <w:rFonts w:ascii="Arial" w:eastAsia="Arial" w:hAnsi="Arial"/>
           <w:b/>
           <w:sz w:val="22"/>
           <w:szCs w:val="14"/>
@@ -129,7 +129,7 @@
       </w:r>
       <w:r>
         <w:rPr>
-          <w:rFonts w:ascii="Arial" w:hAnsi="Arial" w:eastAsia="Arial"/>
+          <w:rFonts w:ascii="Arial" w:eastAsia="Arial" w:hAnsi="Arial"/>
           <w:b/>
           <w:sz w:val="22"/>
           <w:szCs w:val="14"/>
@@ -139,7 +139,7 @@
       </w:r>
       <w:r>
         <w:rPr>
-          <w:rFonts w:ascii="Arial" w:hAnsi="Arial" w:eastAsia="Arial"/>
+          <w:rFonts w:ascii="Arial" w:eastAsia="Arial" w:hAnsi="Arial"/>
           <w:b/>
           <w:sz w:val="22"/>
           <w:szCs w:val="14"/>
@@ -149,7 +149,7 @@
       </w:r>
       <w:r>
         <w:rPr>
-          <w:rFonts w:ascii="Arial" w:hAnsi="Arial" w:eastAsia="Arial"/>
+          <w:rFonts w:ascii="Arial" w:eastAsia="Arial" w:hAnsi="Arial"/>
           <w:b/>
           <w:sz w:val="22"/>
           <w:szCs w:val="14"/>
@@ -223,7 +223,7 @@
       </w:pPr>
       <w:r>
         <w:rPr>
-          <w:rFonts w:ascii="Arial" w:hAnsi="Arial" w:eastAsia="Arial"/>
+          <w:rFonts w:ascii="Arial" w:eastAsia="Arial" w:hAnsi="Arial"/>
           <w:b/>
           <w:sz w:val="22"/>
           <w:shd w:val="clear" w:color="auto" w:fill="B7B7B7"/>
@@ -232,7 +232,7 @@
       </w:r>
       <w:r>
         <w:rPr>
-          <w:rFonts w:ascii="Arial" w:hAnsi="Arial" w:eastAsia="Arial"/>
+          <w:rFonts w:ascii="Arial" w:eastAsia="Arial" w:hAnsi="Arial"/>
           <w:sz w:val="22"/>
           <w:shd w:val="clear" w:color="auto" w:fill="B7B7B7"/>
         </w:rPr>
@@ -241,7 +241,7 @@
       <w:proofErr w:type="spellStart"/>
       <w:r>
         <w:rPr>
-          <w:rFonts w:ascii="Arial" w:hAnsi="Arial" w:eastAsia="Arial"/>
+          <w:rFonts w:ascii="Arial" w:eastAsia="Arial" w:hAnsi="Arial"/>
           <w:b/>
           <w:sz w:val="22"/>
           <w:shd w:val="clear" w:color="auto" w:fill="B7B7B7"/>
@@ -251,7 +251,7 @@
       <w:proofErr w:type="spellEnd"/>
       <w:r>
         <w:rPr>
-          <w:rFonts w:ascii="Arial" w:hAnsi="Arial" w:eastAsia="Arial"/>
+          <w:rFonts w:ascii="Arial" w:eastAsia="Arial" w:hAnsi="Arial"/>
           <w:b/>
           <w:sz w:val="22"/>
           <w:shd w:val="clear" w:color="auto" w:fill="B7B7B7"/>
@@ -260,7 +260,7 @@
       </w:r>
       <w:r>
         <w:rPr>
-          <w:rFonts w:ascii="Arial" w:hAnsi="Arial" w:eastAsia="Arial"/>
+          <w:rFonts w:ascii="Arial" w:eastAsia="Arial" w:hAnsi="Arial"/>
           <w:b/>
           <w:sz w:val="22"/>
           <w:szCs w:val="14"/>
@@ -270,7 +270,7 @@
       </w:r>
       <w:r>
         <w:rPr>
-          <w:rFonts w:ascii="Arial" w:hAnsi="Arial" w:cs="Cambria Math" w:eastAsia="Arial"/>
+          <w:rFonts w:ascii="Arial" w:eastAsia="Arial" w:hAnsi="Arial" w:cs="Cambria Math"/>
           <w:b/>
           <w:sz w:val="22"/>
           <w:szCs w:val="14"/>
@@ -280,7 +280,7 @@
       </w:r>
       <w:r>
         <w:rPr>
-          <w:rFonts w:ascii="Arial" w:hAnsi="Arial" w:eastAsia="Arial"/>
+          <w:rFonts w:ascii="Arial" w:eastAsia="Arial" w:hAnsi="Arial"/>
           <w:b/>
           <w:sz w:val="22"/>
           <w:szCs w:val="14"/>
@@ -342,7 +342,7 @@
       </w:pPr>
       <w:r>
         <w:rPr>
-          <w:rFonts w:ascii="Arial" w:hAnsi="Arial" w:eastAsia="Arial"/>
+          <w:rFonts w:ascii="Arial" w:eastAsia="Arial" w:hAnsi="Arial"/>
           <w:b/>
           <w:sz w:val="22"/>
           <w:shd w:val="clear" w:color="auto" w:fill="B7B7B7"/>
@@ -351,7 +351,7 @@
       </w:r>
       <w:r>
         <w:rPr>
-          <w:rFonts w:ascii="Arial" w:hAnsi="Arial" w:eastAsia="Arial"/>
+          <w:rFonts w:ascii="Arial" w:eastAsia="Arial" w:hAnsi="Arial"/>
           <w:sz w:val="22"/>
           <w:shd w:val="clear" w:color="auto" w:fill="B7B7B7"/>
         </w:rPr>
@@ -360,7 +360,7 @@
       <w:proofErr w:type="spellStart"/>
       <w:r>
         <w:rPr>
-          <w:rFonts w:ascii="Arial" w:hAnsi="Arial" w:eastAsia="Arial"/>
+          <w:rFonts w:ascii="Arial" w:eastAsia="Arial" w:hAnsi="Arial"/>
           <w:b/>
           <w:sz w:val="22"/>
           <w:shd w:val="clear" w:color="auto" w:fill="B7B7B7"/>
@@ -370,7 +370,7 @@
       <w:proofErr w:type="spellEnd"/>
       <w:r>
         <w:rPr>
-          <w:rFonts w:ascii="Arial" w:hAnsi="Arial" w:eastAsia="Arial"/>
+          <w:rFonts w:ascii="Arial" w:eastAsia="Arial" w:hAnsi="Arial"/>
           <w:b/>
           <w:sz w:val="22"/>
           <w:shd w:val="clear" w:color="auto" w:fill="B7B7B7"/>
@@ -379,7 +379,7 @@
       </w:r>
       <w:r>
         <w:rPr>
-          <w:rFonts w:ascii="Arial" w:hAnsi="Arial" w:eastAsia="Arial"/>
+          <w:rFonts w:ascii="Arial" w:eastAsia="Arial" w:hAnsi="Arial"/>
           <w:b/>
           <w:sz w:val="22"/>
           <w:szCs w:val="14"/>
@@ -389,7 +389,7 @@
       </w:r>
       <w:r>
         <w:rPr>
-          <w:rFonts w:ascii="Arial" w:hAnsi="Arial" w:cs="Cambria Math" w:eastAsia="Arial"/>
+          <w:rFonts w:ascii="Arial" w:eastAsia="Arial" w:hAnsi="Arial" w:cs="Cambria Math"/>
           <w:b/>
           <w:sz w:val="22"/>
           <w:szCs w:val="14"/>
@@ -399,7 +399,7 @@
       </w:r>
       <w:r>
         <w:rPr>
-          <w:rFonts w:ascii="Arial" w:hAnsi="Arial" w:eastAsia="Arial"/>
+          <w:rFonts w:ascii="Arial" w:eastAsia="Arial" w:hAnsi="Arial"/>
           <w:b/>
           <w:sz w:val="22"/>
           <w:szCs w:val="14"/>
@@ -1248,7 +1248,7 @@
           <w:rFonts w:ascii="Roboto Mono" w:hAnsi="Roboto Mono"/>
         </w:rPr>
         <w:pict w14:anchorId="36777802">
-          <v:rect id="_x0000_i1074" style="width:0;height:1.5pt" o:hralign="center" o:hrstd="t" o:hr="t" fillcolor="#a0a0a0" stroked="f"/>
+          <v:rect id="_x0000_i1025" style="width:0;height:1.5pt" o:hralign="center" o:hrstd="t" o:hr="t" fillcolor="#a0a0a0" stroked="f"/>
         </w:pict>
       </w:r>
     </w:p>
@@ -1355,7 +1355,7 @@
           <w:rFonts w:ascii="Roboto Mono" w:hAnsi="Roboto Mono"/>
         </w:rPr>
         <w:pict w14:anchorId="2043B37A">
-          <v:rect id="_x0000_i1075" style="width:0;height:1.5pt" o:hralign="center" o:hrstd="t" o:hr="t" fillcolor="#a0a0a0" stroked="f"/>
+          <v:rect id="_x0000_i1026" style="width:0;height:1.5pt" o:hralign="center" o:hrstd="t" o:hr="t" fillcolor="#a0a0a0" stroked="f"/>
         </w:pict>
       </w:r>
     </w:p>
@@ -1462,7 +1462,7 @@
           <w:rFonts w:ascii="Roboto Mono" w:hAnsi="Roboto Mono"/>
         </w:rPr>
         <w:pict w14:anchorId="6049257C">
-          <v:rect id="_x0000_i1076" style="width:0;height:1.5pt" o:hralign="center" o:hrstd="t" o:hr="t" fillcolor="#a0a0a0" stroked="f"/>
+          <v:rect id="_x0000_i1027" style="width:0;height:1.5pt" o:hralign="center" o:hrstd="t" o:hr="t" fillcolor="#a0a0a0" stroked="f"/>
         </w:pict>
       </w:r>
     </w:p>
@@ -1569,7 +1569,7 @@
           <w:rFonts w:ascii="Roboto Mono" w:hAnsi="Roboto Mono"/>
         </w:rPr>
         <w:pict w14:anchorId="713001E7">
-          <v:rect id="_x0000_i1077" style="width:0;height:1.5pt" o:hralign="center" o:hrstd="t" o:hr="t" fillcolor="#a0a0a0" stroked="f"/>
+          <v:rect id="_x0000_i1028" style="width:0;height:1.5pt" o:hralign="center" o:hrstd="t" o:hr="t" fillcolor="#a0a0a0" stroked="f"/>
         </w:pict>
       </w:r>
     </w:p>
@@ -1677,7 +1677,7 @@
           <w:rFonts w:ascii="Roboto Mono" w:hAnsi="Roboto Mono"/>
         </w:rPr>
         <w:pict w14:anchorId="59C5DE6C">
-          <v:rect id="_x0000_i1078" style="width:0;height:1.5pt" o:hralign="center" o:hrstd="t" o:hr="t" fillcolor="#a0a0a0" stroked="f"/>
+          <v:rect id="_x0000_i1029" style="width:0;height:1.5pt" o:hralign="center" o:hrstd="t" o:hr="t" fillcolor="#a0a0a0" stroked="f"/>
         </w:pict>
       </w:r>
     </w:p>
@@ -1759,7 +1759,7 @@
           <w:rFonts w:ascii="Roboto Mono" w:hAnsi="Roboto Mono"/>
         </w:rPr>
         <w:pict w14:anchorId="16F2B778">
-          <v:rect id="_x0000_i1079" style="width:0;height:1.5pt" o:hralign="center" o:hrstd="t" o:hr="t" fillcolor="#a0a0a0" stroked="f"/>
+          <v:rect id="_x0000_i1030" style="width:0;height:1.5pt" o:hralign="center" o:hrstd="t" o:hr="t" fillcolor="#a0a0a0" stroked="f"/>
         </w:pict>
       </w:r>
     </w:p>
@@ -1841,7 +1841,7 @@
           <w:rFonts w:ascii="Roboto Mono" w:hAnsi="Roboto Mono"/>
         </w:rPr>
         <w:pict w14:anchorId="78752F16">
-          <v:rect id="_x0000_i1080" style="width:0;height:1.5pt" o:hralign="center" o:hrstd="t" o:hr="t" fillcolor="#a0a0a0" stroked="f"/>
+          <v:rect id="_x0000_i1031" style="width:0;height:1.5pt" o:hralign="center" o:hrstd="t" o:hr="t" fillcolor="#a0a0a0" stroked="f"/>
         </w:pict>
       </w:r>
     </w:p>
@@ -1868,7 +1868,7 @@
       </w:pPr>
       <w:r>
         <w:rPr>
-          <w:rFonts w:ascii="Arial" w:hAnsi="Arial" w:eastAsia="Arial"/>
+          <w:rFonts w:ascii="Arial" w:eastAsia="Arial" w:hAnsi="Arial"/>
           <w:b/>
           <w:sz w:val="22"/>
           <w:shd w:val="clear" w:color="auto" w:fill="B7B7B7"/>
@@ -1877,7 +1877,7 @@
       </w:r>
       <w:r>
         <w:rPr>
-          <w:rFonts w:ascii="Arial" w:hAnsi="Arial" w:eastAsia="Arial"/>
+          <w:rFonts w:ascii="Arial" w:eastAsia="Arial" w:hAnsi="Arial"/>
           <w:sz w:val="22"/>
           <w:shd w:val="clear" w:color="auto" w:fill="B7B7B7"/>
         </w:rPr>
@@ -1886,7 +1886,7 @@
       <w:proofErr w:type="spellStart"/>
       <w:r>
         <w:rPr>
-          <w:rFonts w:ascii="Arial" w:hAnsi="Arial" w:eastAsia="Arial"/>
+          <w:rFonts w:ascii="Arial" w:eastAsia="Arial" w:hAnsi="Arial"/>
           <w:b/>
           <w:sz w:val="22"/>
           <w:shd w:val="clear" w:color="auto" w:fill="B7B7B7"/>
@@ -1896,7 +1896,7 @@
       <w:proofErr w:type="spellEnd"/>
       <w:r>
         <w:rPr>
-          <w:rFonts w:ascii="Arial" w:hAnsi="Arial" w:eastAsia="Arial"/>
+          <w:rFonts w:ascii="Arial" w:eastAsia="Arial" w:hAnsi="Arial"/>
           <w:b/>
           <w:sz w:val="22"/>
           <w:shd w:val="clear" w:color="auto" w:fill="B7B7B7"/>
@@ -1905,7 +1905,7 @@
       </w:r>
       <w:r>
         <w:rPr>
-          <w:rFonts w:ascii="Arial" w:hAnsi="Arial" w:eastAsia="Arial"/>
+          <w:rFonts w:ascii="Arial" w:eastAsia="Arial" w:hAnsi="Arial"/>
           <w:b/>
           <w:sz w:val="22"/>
           <w:szCs w:val="14"/>
@@ -1915,7 +1915,7 @@
       </w:r>
       <w:r>
         <w:rPr>
-          <w:rFonts w:ascii="Arial" w:hAnsi="Arial" w:cs="Cambria Math" w:eastAsia="Arial"/>
+          <w:rFonts w:ascii="Arial" w:eastAsia="Arial" w:hAnsi="Arial" w:cs="Cambria Math"/>
           <w:b/>
           <w:sz w:val="22"/>
           <w:szCs w:val="14"/>
@@ -1925,7 +1925,7 @@
       </w:r>
       <w:r>
         <w:rPr>
-          <w:rFonts w:ascii="Arial" w:hAnsi="Arial" w:eastAsia="Arial"/>
+          <w:rFonts w:ascii="Arial" w:eastAsia="Arial" w:hAnsi="Arial"/>
           <w:b/>
           <w:sz w:val="22"/>
           <w:szCs w:val="14"/>
@@ -2011,10 +2011,7 @@
     </w:p>
     <w:p>
       <w:pPr>
-        <w:numPr>
-          <w:ilvl w:val="0"/>
-          <w:numId w:val="2"/>
-        </w:numPr>
+        <w:ind w:left="720"/>
         <w:rPr>
           <w:rFonts w:ascii="Roboto Mono" w:hAnsi="Roboto Mono"/>
         </w:rPr>
@@ -2044,7 +2041,7 @@
       </w:pPr>
       <w:r>
         <w:rPr>
-          <w:rFonts w:ascii="Arial" w:hAnsi="Arial" w:eastAsia="Arial"/>
+          <w:rFonts w:ascii="Arial" w:eastAsia="Arial" w:hAnsi="Arial"/>
           <w:b/>
           <w:sz w:val="22"/>
           <w:shd w:val="clear" w:color="auto" w:fill="B7B7B7"/>
@@ -2053,7 +2050,7 @@
       </w:r>
       <w:r>
         <w:rPr>
-          <w:rFonts w:ascii="Arial" w:hAnsi="Arial" w:eastAsia="Arial"/>
+          <w:rFonts w:ascii="Arial" w:eastAsia="Arial" w:hAnsi="Arial"/>
           <w:sz w:val="22"/>
           <w:shd w:val="clear" w:color="auto" w:fill="B7B7B7"/>
         </w:rPr>
@@ -2062,7 +2059,7 @@
       <w:proofErr w:type="spellStart"/>
       <w:r>
         <w:rPr>
-          <w:rFonts w:ascii="Arial" w:hAnsi="Arial" w:eastAsia="Arial"/>
+          <w:rFonts w:ascii="Arial" w:eastAsia="Arial" w:hAnsi="Arial"/>
           <w:b/>
           <w:sz w:val="22"/>
           <w:shd w:val="clear" w:color="auto" w:fill="B7B7B7"/>
@@ -2072,7 +2069,7 @@
       <w:proofErr w:type="spellEnd"/>
       <w:r>
         <w:rPr>
-          <w:rFonts w:ascii="Arial" w:hAnsi="Arial" w:eastAsia="Arial"/>
+          <w:rFonts w:ascii="Arial" w:eastAsia="Arial" w:hAnsi="Arial"/>
           <w:b/>
           <w:sz w:val="22"/>
           <w:shd w:val="clear" w:color="auto" w:fill="B7B7B7"/>
@@ -2081,7 +2078,7 @@
       </w:r>
       <w:r>
         <w:rPr>
-          <w:rFonts w:ascii="Arial" w:hAnsi="Arial" w:eastAsia="Arial"/>
+          <w:rFonts w:ascii="Arial" w:eastAsia="Arial" w:hAnsi="Arial"/>
           <w:b/>
           <w:sz w:val="22"/>
           <w:szCs w:val="14"/>
@@ -2091,7 +2088,7 @@
       </w:r>
       <w:r>
         <w:rPr>
-          <w:rFonts w:ascii="Arial" w:hAnsi="Arial" w:cs="Cambria Math" w:eastAsia="Arial"/>
+          <w:rFonts w:ascii="Arial" w:eastAsia="Arial" w:hAnsi="Arial" w:cs="Cambria Math"/>
           <w:b/>
           <w:sz w:val="22"/>
           <w:szCs w:val="14"/>
@@ -2101,7 +2098,7 @@
       </w:r>
       <w:r>
         <w:rPr>
-          <w:rFonts w:ascii="Arial" w:hAnsi="Arial" w:eastAsia="Arial"/>
+          <w:rFonts w:ascii="Arial" w:eastAsia="Arial" w:hAnsi="Arial"/>
           <w:b/>
           <w:sz w:val="22"/>
           <w:szCs w:val="14"/>
@@ -2199,11 +2196,299 @@
     </w:p>
     <w:p>
       <w:pPr>
+        <w:rPr>
+          <w:rFonts w:ascii="Roboto Mono" w:hAnsi="Roboto Mono"/>
+        </w:rPr>
+      </w:pPr>
+      <w:r>
+        <w:rPr>
+          <w:rFonts w:ascii="Arial" w:eastAsia="Arial" w:hAnsi="Arial"/>
+          <w:b/>
+          <w:sz w:val="22"/>
+          <w:shd w:val="clear" w:color="auto" w:fill="B7B7B7"/>
+        </w:rPr>
+        <w:t># Source</w:t>
+      </w:r>
+      <w:r>
+        <w:rPr>
+          <w:rFonts w:ascii="Arial" w:eastAsia="Arial" w:hAnsi="Arial"/>
+          <w:sz w:val="22"/>
+          <w:shd w:val="clear" w:color="auto" w:fill="B7B7B7"/>
+        </w:rPr>
+        <w:t xml:space="preserve">: </w:t>
+      </w:r>
+      <w:proofErr w:type="spellStart"/>
+      <w:r>
+        <w:rPr>
+          <w:rFonts w:ascii="Arial" w:eastAsia="Arial" w:hAnsi="Arial"/>
+          <w:b/>
+          <w:sz w:val="22"/>
+          <w:shd w:val="clear" w:color="auto" w:fill="B7B7B7"/>
+        </w:rPr>
+        <w:t>Chatgpt</w:t>
+      </w:r>
+      <w:proofErr w:type="spellEnd"/>
+      <w:r>
+        <w:rPr>
+          <w:rFonts w:ascii="Arial" w:eastAsia="Arial" w:hAnsi="Arial"/>
+          <w:b/>
+          <w:sz w:val="22"/>
+          <w:shd w:val="clear" w:color="auto" w:fill="B7B7B7"/>
+        </w:rPr>
+        <w:t xml:space="preserve"> </w:t>
+      </w:r>
+      <w:r>
+        <w:rPr>
+          <w:rFonts w:ascii="Arial" w:eastAsia="Arial" w:hAnsi="Arial"/>
+          <w:b/>
+          <w:sz w:val="22"/>
+          <w:szCs w:val="14"/>
+          <w:shd w:val="clear" w:color="auto" w:fill="B7B7B7"/>
+        </w:rPr>
+        <w:t>(GPT</w:t>
+      </w:r>
+      <w:r>
+        <w:rPr>
+          <w:rFonts w:ascii="Arial" w:eastAsia="Arial" w:hAnsi="Arial" w:cs="Cambria Math"/>
+          <w:b/>
+          <w:sz w:val="22"/>
+          <w:szCs w:val="14"/>
+          <w:shd w:val="clear" w:color="auto" w:fill="B7B7B7"/>
+        </w:rPr>
+        <w:t>‑</w:t>
+      </w:r>
+      <w:r>
+        <w:rPr>
+          <w:rFonts w:ascii="Arial" w:eastAsia="Arial" w:hAnsi="Arial"/>
+          <w:b/>
+          <w:sz w:val="22"/>
+          <w:szCs w:val="14"/>
+          <w:shd w:val="clear" w:color="auto" w:fill="B7B7B7"/>
+        </w:rPr>
+        <w:t>5 Mini) at [12/9/2025]</w:t>
+      </w:r>
+    </w:p>
+    <w:p>
+      <w:pPr>
+        <w:rPr>
+          <w:rFonts w:ascii="Roboto Mono" w:hAnsi="Roboto Mono"/>
+        </w:rPr>
+      </w:pPr>
+      <w:r>
+        <w:rPr>
+          <w:rFonts w:ascii="Roboto Mono" w:hAnsi="Roboto Mono"/>
+        </w:rPr>
+        <w:t>A computer network is a system where two or more computers or devices are connected to share resources, exchange data, and communicate with each other. Networks can range from small setups in a home to vast global systems like the Internet.</w:t>
+      </w:r>
+    </w:p>
+    <w:p>
+      <w:pPr>
+        <w:rPr>
+          <w:rFonts w:ascii="Roboto Mono" w:hAnsi="Roboto Mono"/>
+        </w:rPr>
+      </w:pPr>
+      <w:r>
+        <w:rPr>
+          <w:rFonts w:ascii="Roboto Mono" w:hAnsi="Roboto Mono"/>
+        </w:rPr>
+        <w:pict w14:anchorId="35FC2850">
+          <v:rect id="_x0000_i1032" style="width:0;height:1.5pt" o:hralign="center" o:hrstd="t" o:hr="t" fillcolor="#a0a0a0" stroked="f"/>
+        </w:pict>
+      </w:r>
+    </w:p>
+    <w:p>
+      <w:pPr>
+        <w:pStyle w:val="Heading3"/>
+      </w:pPr>
+      <w:r>
+        <w:rPr>
+          <w:rFonts w:ascii="Segoe UI Emoji" w:hAnsi="Segoe UI Emoji" w:cs="Segoe UI Emoji"/>
+        </w:rPr>
+        <w:t>🧠</w:t>
+      </w:r>
+      <w:r>
+        <w:t xml:space="preserve"> In Simple Terms:</w:t>
+      </w:r>
+    </w:p>
+    <w:p>
+      <w:pPr>
+        <w:rPr>
+          <w:rFonts w:ascii="Roboto Mono" w:hAnsi="Roboto Mono"/>
+        </w:rPr>
+      </w:pPr>
+      <w:r>
+        <w:rPr>
+          <w:rFonts w:ascii="Arial" w:eastAsia="Arial" w:hAnsi="Arial"/>
+          <w:b/>
+          <w:sz w:val="22"/>
+          <w:shd w:val="clear" w:color="auto" w:fill="B7B7B7"/>
+        </w:rPr>
+        <w:t># Source</w:t>
+      </w:r>
+      <w:r>
+        <w:rPr>
+          <w:rFonts w:ascii="Arial" w:eastAsia="Arial" w:hAnsi="Arial"/>
+          <w:sz w:val="22"/>
+          <w:shd w:val="clear" w:color="auto" w:fill="B7B7B7"/>
+        </w:rPr>
+        <w:t xml:space="preserve">: </w:t>
+      </w:r>
+      <w:proofErr w:type="spellStart"/>
+      <w:r>
+        <w:rPr>
+          <w:rFonts w:ascii="Arial" w:eastAsia="Arial" w:hAnsi="Arial"/>
+          <w:b/>
+          <w:sz w:val="22"/>
+          <w:shd w:val="clear" w:color="auto" w:fill="B7B7B7"/>
+        </w:rPr>
+        <w:t>Chatgpt</w:t>
+      </w:r>
+      <w:proofErr w:type="spellEnd"/>
+      <w:r>
+        <w:rPr>
+          <w:rFonts w:ascii="Arial" w:eastAsia="Arial" w:hAnsi="Arial"/>
+          <w:b/>
+          <w:sz w:val="22"/>
+          <w:shd w:val="clear" w:color="auto" w:fill="B7B7B7"/>
+        </w:rPr>
+        <w:t xml:space="preserve"> </w:t>
+      </w:r>
+      <w:r>
+        <w:rPr>
+          <w:rFonts w:ascii="Arial" w:eastAsia="Arial" w:hAnsi="Arial"/>
+          <w:b/>
+          <w:sz w:val="22"/>
+          <w:szCs w:val="14"/>
+          <w:shd w:val="clear" w:color="auto" w:fill="B7B7B7"/>
+        </w:rPr>
+        <w:t>(GPT</w:t>
+      </w:r>
+      <w:r>
+        <w:rPr>
+          <w:rFonts w:ascii="Arial" w:eastAsia="Arial" w:hAnsi="Arial" w:cs="Cambria Math"/>
+          <w:b/>
+          <w:sz w:val="22"/>
+          <w:szCs w:val="14"/>
+          <w:shd w:val="clear" w:color="auto" w:fill="B7B7B7"/>
+        </w:rPr>
+        <w:t>‑</w:t>
+      </w:r>
+      <w:r>
+        <w:rPr>
+          <w:rFonts w:ascii="Arial" w:eastAsia="Arial" w:hAnsi="Arial"/>
+          <w:b/>
+          <w:sz w:val="22"/>
+          <w:szCs w:val="14"/>
+          <w:shd w:val="clear" w:color="auto" w:fill="B7B7B7"/>
+        </w:rPr>
+        <w:t>5 Mini) at [12/9/2025]</w:t>
+      </w:r>
+    </w:p>
+    <w:p>
+      <w:pPr>
+        <w:rPr>
+          <w:rFonts w:ascii="Roboto Mono" w:hAnsi="Roboto Mono"/>
+        </w:rPr>
+      </w:pPr>
+      <w:r>
+        <w:rPr>
+          <w:rFonts w:ascii="Roboto Mono" w:eastAsia="Arial" w:hAnsi="Roboto Mono"/>
+          <w:b/>
+          <w:bCs/>
+          <w:sz w:val="22"/>
+        </w:rPr>
+        <w:t>Network = Devices linked together to share data and resources.</w:t>
+      </w:r>
+    </w:p>
+    <w:p>
+      <w:pPr>
         <w:spacing w:before="240" w:after="240"/>
-      </w:pPr>
-      <w:r>
-        <w:rPr>
-          <w:rFonts w:ascii="Arial" w:hAnsi="Arial" w:eastAsia="Arial"/>
+        <w:rPr>
+          <w:rFonts w:ascii="Roboto Mono" w:hAnsi="Roboto Mono"/>
+        </w:rPr>
+      </w:pPr>
+      <w:r>
+        <w:rPr>
+          <w:rFonts w:ascii="Roboto Mono" w:hAnsi="Roboto Mono"/>
+        </w:rPr>
+        <w:t xml:space="preserve">These connections can be </w:t>
+      </w:r>
+      <w:r>
+        <w:rPr>
+          <w:rFonts w:ascii="Roboto Mono" w:hAnsi="Roboto Mono"/>
+          <w:b/>
+          <w:bCs/>
+        </w:rPr>
+        <w:t>wired (Ethernet cables)</w:t>
+      </w:r>
+      <w:r>
+        <w:rPr>
+          <w:rFonts w:ascii="Roboto Mono" w:hAnsi="Roboto Mono"/>
+        </w:rPr>
+        <w:t xml:space="preserve"> or </w:t>
+      </w:r>
+      <w:r>
+        <w:rPr>
+          <w:rFonts w:ascii="Roboto Mono" w:hAnsi="Roboto Mono"/>
+          <w:b/>
+          <w:bCs/>
+        </w:rPr>
+        <w:t>wireless (Wi-Fi, Bluetooth)</w:t>
+      </w:r>
+      <w:r>
+        <w:rPr>
+          <w:rFonts w:ascii="Roboto Mono" w:hAnsi="Roboto Mono"/>
+        </w:rPr>
+        <w:t>.</w:t>
+      </w:r>
+    </w:p>
+    <w:p>
+      <w:pPr>
+        <w:rPr>
+          <w:rFonts w:ascii="Roboto Mono" w:hAnsi="Roboto Mono"/>
+        </w:rPr>
+      </w:pPr>
+      <w:r>
+        <w:rPr>
+          <w:rFonts w:ascii="Roboto Mono" w:hAnsi="Roboto Mono"/>
+        </w:rPr>
+        <w:pict w14:anchorId="25A34D72">
+          <v:rect id="_x0000_i1033" style="width:0;height:1.5pt" o:hralign="center" o:hrstd="t" o:hr="t" fillcolor="#a0a0a0" stroked="f"/>
+        </w:pict>
+      </w:r>
+    </w:p>
+    <w:p>
+      <w:pPr>
+        <w:pStyle w:val="Heading3"/>
+      </w:pPr>
+      <w:r>
+        <w:rPr>
+          <w:rFonts w:ascii="Segoe UI Emoji" w:hAnsi="Segoe UI Emoji" w:cs="Segoe UI Emoji"/>
+        </w:rPr>
+        <w:t>✅</w:t>
+      </w:r>
+      <w:r>
+        <w:t xml:space="preserve"> </w:t>
+      </w:r>
+      <w:bookmarkStart w:id="1" w:name="_Hlk216171727"/>
+      <w:r>
+        <w:t>Common Types of Networks</w:t>
+      </w:r>
+      <w:bookmarkEnd w:id="1"/>
+      <w:r>
+        <w:t>:</w:t>
+      </w:r>
+    </w:p>
+    <w:p>
+      <w:pPr>
+        <w:rPr>
+          <w:rFonts w:ascii="Roboto Mono" w:hAnsi="Roboto Mono"/>
+        </w:rPr>
+      </w:pPr>
+      <w:bookmarkStart w:id="2" w:name="_Hlk216171260"/>
+      <w:r>
+        <w:rPr>
+          <w:rFonts w:ascii="Arial" w:eastAsia="Arial" w:hAnsi="Arial"/>
           <w:b/>
           <w:sz w:val="22"/>
           <w:shd w:val="clear" w:color="auto" w:fill="B7B7B7"/>
@@ -2212,7 +2497,7 @@
       </w:r>
       <w:r>
         <w:rPr>
-          <w:rFonts w:ascii="Arial" w:hAnsi="Arial" w:eastAsia="Arial"/>
+          <w:rFonts w:ascii="Arial" w:eastAsia="Arial" w:hAnsi="Arial"/>
           <w:sz w:val="22"/>
           <w:shd w:val="clear" w:color="auto" w:fill="B7B7B7"/>
         </w:rPr>
@@ -2221,7 +2506,7 @@
       <w:proofErr w:type="spellStart"/>
       <w:r>
         <w:rPr>
-          <w:rFonts w:ascii="Arial" w:hAnsi="Arial" w:eastAsia="Arial"/>
+          <w:rFonts w:ascii="Arial" w:eastAsia="Arial" w:hAnsi="Arial"/>
           <w:b/>
           <w:sz w:val="22"/>
           <w:shd w:val="clear" w:color="auto" w:fill="B7B7B7"/>
@@ -2231,7 +2516,7 @@
       <w:proofErr w:type="spellEnd"/>
       <w:r>
         <w:rPr>
-          <w:rFonts w:ascii="Arial" w:hAnsi="Arial" w:eastAsia="Arial"/>
+          <w:rFonts w:ascii="Arial" w:eastAsia="Arial" w:hAnsi="Arial"/>
           <w:b/>
           <w:sz w:val="22"/>
           <w:shd w:val="clear" w:color="auto" w:fill="B7B7B7"/>
@@ -2240,7 +2525,7 @@
       </w:r>
       <w:r>
         <w:rPr>
-          <w:rFonts w:ascii="Arial" w:hAnsi="Arial" w:eastAsia="Arial"/>
+          <w:rFonts w:ascii="Arial" w:eastAsia="Arial" w:hAnsi="Arial"/>
           <w:b/>
           <w:sz w:val="22"/>
           <w:szCs w:val="14"/>
@@ -2250,7 +2535,7 @@
       </w:r>
       <w:r>
         <w:rPr>
-          <w:rFonts w:ascii="Arial" w:hAnsi="Arial" w:cs="Cambria Math" w:eastAsia="Arial"/>
+          <w:rFonts w:ascii="Arial" w:eastAsia="Arial" w:hAnsi="Arial" w:cs="Cambria Math"/>
           <w:b/>
           <w:sz w:val="22"/>
           <w:szCs w:val="14"/>
@@ -2260,288 +2545,7 @@
       </w:r>
       <w:r>
         <w:rPr>
-          <w:rFonts w:ascii="Arial" w:hAnsi="Arial" w:eastAsia="Arial"/>
-          <w:b/>
-          <w:sz w:val="22"/>
-          <w:szCs w:val="14"/>
-          <w:shd w:val="clear" w:color="auto" w:fill="B7B7B7"/>
-        </w:rPr>
-        <w:t>5 Mini) at [12/9/2025]</w:t>
-      </w:r>
-      <w:r>
-        <w:rPr>
-          <w:rFonts w:ascii="Arial" w:hAnsi="Arial" w:eastAsia="Arial"/>
-          <w:sz w:val="22"/>
-        </w:rPr>
-        <w:br/>
-        <w:t>A computer network is a system where two or more computers or devices are connected to share resources, exchange data, and communicate with each other. Networks can range from small setups in a home to vast global systems like the Internet.</w:t>
-      </w:r>
-    </w:p>
-    <w:p>
-      <w:pPr>
-        <w:rPr>
-          <w:rFonts w:ascii="Roboto Mono" w:hAnsi="Roboto Mono"/>
-        </w:rPr>
-      </w:pPr>
-      <w:r>
-        <w:rPr>
-          <w:rFonts w:ascii="Roboto Mono" w:hAnsi="Roboto Mono"/>
-        </w:rPr>
-        <w:pict w14:anchorId="35FC2850">
-          <v:rect id="_x0000_i1253" style="width:0;height:1.5pt" o:hralign="center" o:hrstd="t" o:hr="t" fillcolor="#a0a0a0" stroked="f"/>
-        </w:pict>
-      </w:r>
-    </w:p>
-    <w:p>
-      <w:pPr>
-        <w:pStyle w:val="Heading3"/>
-      </w:pPr>
-      <w:r>
-        <w:rPr>
-          <w:rFonts w:ascii="Segoe UI Emoji" w:hAnsi="Segoe UI Emoji" w:cs="Segoe UI Emoji"/>
-        </w:rPr>
-        <w:t>🧠</w:t>
-      </w:r>
-      <w:r>
-        <w:t xml:space="preserve"> In Simple Terms:</w:t>
-      </w:r>
-    </w:p>
-    <w:p>
-      <w:pPr>
-        <w:rPr>
-          <w:rFonts w:ascii="Roboto Mono" w:hAnsi="Roboto Mono"/>
-        </w:rPr>
-      </w:pPr>
-      <w:r>
-        <w:rPr>
-          <w:rFonts w:ascii="Arial" w:hAnsi="Arial" w:eastAsia="Arial"/>
-          <w:b/>
-          <w:sz w:val="22"/>
-          <w:shd w:val="clear" w:color="auto" w:fill="B7B7B7"/>
-        </w:rPr>
-        <w:t># Source</w:t>
-      </w:r>
-      <w:r>
-        <w:rPr>
-          <w:rFonts w:ascii="Arial" w:hAnsi="Arial" w:eastAsia="Arial"/>
-          <w:sz w:val="22"/>
-          <w:shd w:val="clear" w:color="auto" w:fill="B7B7B7"/>
-        </w:rPr>
-        <w:t xml:space="preserve">: </w:t>
-      </w:r>
-      <w:proofErr w:type="spellStart"/>
-      <w:r>
-        <w:rPr>
-          <w:rFonts w:ascii="Arial" w:hAnsi="Arial" w:eastAsia="Arial"/>
-          <w:b/>
-          <w:sz w:val="22"/>
-          <w:shd w:val="clear" w:color="auto" w:fill="B7B7B7"/>
-        </w:rPr>
-        <w:t>Chatgpt</w:t>
-      </w:r>
-      <w:proofErr w:type="spellEnd"/>
-      <w:r>
-        <w:rPr>
-          <w:rFonts w:ascii="Arial" w:hAnsi="Arial" w:eastAsia="Arial"/>
-          <w:b/>
-          <w:sz w:val="22"/>
-          <w:shd w:val="clear" w:color="auto" w:fill="B7B7B7"/>
-        </w:rPr>
-        <w:t xml:space="preserve"> </w:t>
-      </w:r>
-      <w:r>
-        <w:rPr>
-          <w:rFonts w:ascii="Arial" w:hAnsi="Arial" w:eastAsia="Arial"/>
-          <w:b/>
-          <w:sz w:val="22"/>
-          <w:szCs w:val="14"/>
-          <w:shd w:val="clear" w:color="auto" w:fill="B7B7B7"/>
-        </w:rPr>
-        <w:t>(GPT</w:t>
-      </w:r>
-      <w:r>
-        <w:rPr>
-          <w:rFonts w:ascii="Arial" w:hAnsi="Arial" w:cs="Cambria Math" w:eastAsia="Arial"/>
-          <w:b/>
-          <w:sz w:val="22"/>
-          <w:szCs w:val="14"/>
-          <w:shd w:val="clear" w:color="auto" w:fill="B7B7B7"/>
-        </w:rPr>
-        <w:t>‑</w:t>
-      </w:r>
-      <w:r>
-        <w:rPr>
-          <w:rFonts w:ascii="Arial" w:hAnsi="Arial" w:eastAsia="Arial"/>
-          <w:b/>
-          <w:sz w:val="22"/>
-          <w:szCs w:val="14"/>
-          <w:shd w:val="clear" w:color="auto" w:fill="B7B7B7"/>
-        </w:rPr>
-        <w:t>5 Mini) at [12/9/2025]</w:t>
-      </w:r>
-      <w:r>
-        <w:rPr>
-          <w:rFonts w:ascii="Arial" w:hAnsi="Arial" w:eastAsia="Arial"/>
-          <w:sz w:val="22"/>
-        </w:rPr>
-        <w:br/>
-      </w:r>
-      <w:r>
-        <w:rPr>
-          <w:rFonts w:ascii="Arial" w:hAnsi="Arial" w:eastAsia="Arial"/>
-          <w:b/>
-          <w:bCs/>
-          <w:sz w:val="22"/>
-        </w:rPr>
-        <w:t>Network = Devices linked together to share data and resources.</w:t>
-      </w:r>
-    </w:p>
-    <w:p>
-      <w:pPr>
-        <w:spacing w:before="240" w:after="240"/>
-        <w:rPr>
-          <w:rFonts w:ascii="Roboto Mono" w:hAnsi="Roboto Mono"/>
-        </w:rPr>
-      </w:pPr>
-      <w:r>
-        <w:rPr>
-          <w:rFonts w:ascii="Roboto Mono" w:hAnsi="Roboto Mono"/>
-        </w:rPr>
-        <w:t xml:space="preserve">These connections can be </w:t>
-      </w:r>
-      <w:r>
-        <w:rPr>
-          <w:rFonts w:ascii="Roboto Mono" w:hAnsi="Roboto Mono"/>
-          <w:b/>
-          <w:bCs/>
-        </w:rPr>
-        <w:t>wired (Ethernet cables)</w:t>
-      </w:r>
-      <w:r>
-        <w:rPr>
-          <w:rFonts w:ascii="Roboto Mono" w:hAnsi="Roboto Mono"/>
-        </w:rPr>
-        <w:t xml:space="preserve"> or </w:t>
-      </w:r>
-      <w:r>
-        <w:rPr>
-          <w:rFonts w:ascii="Roboto Mono" w:hAnsi="Roboto Mono"/>
-          <w:b/>
-          <w:bCs/>
-        </w:rPr>
-        <w:t>wireless (Wi-Fi, Bluetooth)</w:t>
-      </w:r>
-      <w:r>
-        <w:rPr>
-          <w:rFonts w:ascii="Roboto Mono" w:hAnsi="Roboto Mono"/>
-        </w:rPr>
-        <w:t>.</w:t>
-      </w:r>
-    </w:p>
-    <w:p>
-      <w:pPr>
-        <w:rPr>
-          <w:rFonts w:ascii="Roboto Mono" w:hAnsi="Roboto Mono"/>
-        </w:rPr>
-      </w:pPr>
-      <w:r>
-        <w:rPr>
-          <w:rFonts w:ascii="Roboto Mono" w:hAnsi="Roboto Mono"/>
-        </w:rPr>
-        <w:pict w14:anchorId="25A34D72">
-          <v:rect id="_x0000_i1254" style="width:0;height:1.5pt" o:hralign="center" o:hrstd="t" o:hr="t" fillcolor="#a0a0a0" stroked="f"/>
-        </w:pict>
-      </w:r>
-    </w:p>
-    <w:p>
-      <w:pPr>
-        <w:pStyle w:val="Heading3"/>
-      </w:pPr>
-      <w:r>
-        <w:rPr>
-          <w:rFonts w:ascii="Segoe UI Emoji" w:hAnsi="Segoe UI Emoji" w:cs="Segoe UI Emoji"/>
-        </w:rPr>
-        <w:t>✅</w:t>
-      </w:r>
-      <w:r>
-        <w:t xml:space="preserve"> </w:t>
-      </w:r>
-      <w:bookmarkStart w:id="1" w:name="_Hlk216171727"/>
-      <w:r>
-        <w:t>Common Types of Networks</w:t>
-      </w:r>
-      <w:bookmarkEnd w:id="1"/>
-      <w:r>
-        <w:t>:</w:t>
-      </w:r>
-    </w:p>
-    <w:p>
-      <w:pPr>
-        <w:rPr>
-          <w:rFonts w:ascii="Roboto Mono" w:hAnsi="Roboto Mono"/>
-        </w:rPr>
-      </w:pPr>
-      <w:bookmarkStart w:id="2" w:name="_Hlk216171260"/>
-      <w:r>
-        <w:rPr>
-          <w:rFonts w:ascii="Arial" w:hAnsi="Arial" w:eastAsia="Arial"/>
-          <w:b/>
-          <w:sz w:val="22"/>
-          <w:shd w:val="clear" w:color="auto" w:fill="B7B7B7"/>
-        </w:rPr>
-        <w:t># Source</w:t>
-      </w:r>
-      <w:r>
-        <w:rPr>
-          <w:rFonts w:ascii="Arial" w:hAnsi="Arial" w:eastAsia="Arial"/>
-          <w:sz w:val="22"/>
-          <w:shd w:val="clear" w:color="auto" w:fill="B7B7B7"/>
-        </w:rPr>
-        <w:t xml:space="preserve">: </w:t>
-      </w:r>
-      <w:proofErr w:type="spellStart"/>
-      <w:r>
-        <w:rPr>
-          <w:rFonts w:ascii="Arial" w:hAnsi="Arial" w:eastAsia="Arial"/>
-          <w:b/>
-          <w:sz w:val="22"/>
-          <w:shd w:val="clear" w:color="auto" w:fill="B7B7B7"/>
-        </w:rPr>
-        <w:t>Chatgpt</w:t>
-      </w:r>
-      <w:proofErr w:type="spellEnd"/>
-      <w:r>
-        <w:rPr>
-          <w:rFonts w:ascii="Arial" w:hAnsi="Arial" w:eastAsia="Arial"/>
-          <w:b/>
-          <w:sz w:val="22"/>
-          <w:shd w:val="clear" w:color="auto" w:fill="B7B7B7"/>
-        </w:rPr>
-        <w:t xml:space="preserve"> </w:t>
-      </w:r>
-      <w:r>
-        <w:rPr>
-          <w:rFonts w:ascii="Arial" w:hAnsi="Arial" w:eastAsia="Arial"/>
-          <w:b/>
-          <w:sz w:val="22"/>
-          <w:szCs w:val="14"/>
-          <w:shd w:val="clear" w:color="auto" w:fill="B7B7B7"/>
-        </w:rPr>
-        <w:t>(GPT</w:t>
-      </w:r>
-      <w:r>
-        <w:rPr>
-          <w:rFonts w:ascii="Arial" w:hAnsi="Arial" w:cs="Cambria Math" w:eastAsia="Arial"/>
-          <w:b/>
-          <w:sz w:val="22"/>
-          <w:szCs w:val="14"/>
-          <w:shd w:val="clear" w:color="auto" w:fill="B7B7B7"/>
-        </w:rPr>
-        <w:t>‑</w:t>
-      </w:r>
-      <w:r>
-        <w:rPr>
-          <w:rFonts w:ascii="Arial" w:hAnsi="Arial" w:eastAsia="Arial"/>
+          <w:rFonts w:ascii="Arial" w:eastAsia="Arial" w:hAnsi="Arial"/>
           <w:b/>
           <w:sz w:val="22"/>
           <w:szCs w:val="14"/>
@@ -2688,7 +2692,7 @@
           <w:rFonts w:ascii="Roboto Mono" w:hAnsi="Roboto Mono"/>
         </w:rPr>
         <w:pict w14:anchorId="04DED3BA">
-          <v:rect id="_x0000_i1255" style="width:0;height:1.5pt" o:hralign="center" o:hrstd="t" o:hr="t" fillcolor="#a0a0a0" stroked="f"/>
+          <v:rect id="_x0000_i1034" style="width:0;height:1.5pt" o:hralign="center" o:hrstd="t" o:hr="t" fillcolor="#a0a0a0" stroked="f"/>
         </w:pict>
       </w:r>
     </w:p>
@@ -2714,7 +2718,7 @@
       </w:pPr>
       <w:r>
         <w:rPr>
-          <w:rFonts w:ascii="Arial" w:hAnsi="Arial" w:eastAsia="Arial"/>
+          <w:rFonts w:ascii="Arial" w:eastAsia="Arial" w:hAnsi="Arial"/>
           <w:b/>
           <w:sz w:val="22"/>
           <w:shd w:val="clear" w:color="auto" w:fill="B7B7B7"/>
@@ -2723,7 +2727,7 @@
       </w:r>
       <w:r>
         <w:rPr>
-          <w:rFonts w:ascii="Arial" w:hAnsi="Arial" w:eastAsia="Arial"/>
+          <w:rFonts w:ascii="Arial" w:eastAsia="Arial" w:hAnsi="Arial"/>
           <w:sz w:val="22"/>
           <w:shd w:val="clear" w:color="auto" w:fill="B7B7B7"/>
         </w:rPr>
@@ -2732,7 +2736,7 @@
       <w:proofErr w:type="spellStart"/>
       <w:r>
         <w:rPr>
-          <w:rFonts w:ascii="Arial" w:hAnsi="Arial" w:eastAsia="Arial"/>
+          <w:rFonts w:ascii="Arial" w:eastAsia="Arial" w:hAnsi="Arial"/>
           <w:b/>
           <w:sz w:val="22"/>
           <w:shd w:val="clear" w:color="auto" w:fill="B7B7B7"/>
@@ -2742,7 +2746,7 @@
       <w:proofErr w:type="spellEnd"/>
       <w:r>
         <w:rPr>
-          <w:rFonts w:ascii="Arial" w:hAnsi="Arial" w:eastAsia="Arial"/>
+          <w:rFonts w:ascii="Arial" w:eastAsia="Arial" w:hAnsi="Arial"/>
           <w:b/>
           <w:sz w:val="22"/>
           <w:shd w:val="clear" w:color="auto" w:fill="B7B7B7"/>
@@ -2751,7 +2755,7 @@
       </w:r>
       <w:r>
         <w:rPr>
-          <w:rFonts w:ascii="Arial" w:hAnsi="Arial" w:eastAsia="Arial"/>
+          <w:rFonts w:ascii="Arial" w:eastAsia="Arial" w:hAnsi="Arial"/>
           <w:b/>
           <w:sz w:val="22"/>
           <w:szCs w:val="14"/>
@@ -2761,7 +2765,7 @@
       </w:r>
       <w:r>
         <w:rPr>
-          <w:rFonts w:ascii="Arial" w:hAnsi="Arial" w:cs="Cambria Math" w:eastAsia="Arial"/>
+          <w:rFonts w:ascii="Arial" w:eastAsia="Arial" w:hAnsi="Arial" w:cs="Cambria Math"/>
           <w:b/>
           <w:sz w:val="22"/>
           <w:szCs w:val="14"/>
@@ -2771,7 +2775,7 @@
       </w:r>
       <w:r>
         <w:rPr>
-          <w:rFonts w:ascii="Arial" w:hAnsi="Arial" w:eastAsia="Arial"/>
+          <w:rFonts w:ascii="Arial" w:eastAsia="Arial" w:hAnsi="Arial"/>
           <w:b/>
           <w:sz w:val="22"/>
           <w:szCs w:val="14"/>
@@ -2876,7 +2880,7 @@
           <w:rFonts w:ascii="Roboto Mono" w:hAnsi="Roboto Mono"/>
         </w:rPr>
         <w:pict w14:anchorId="736D3AB8">
-          <v:rect id="_x0000_i1256" style="width:0;height:1.5pt" o:hralign="center" o:hrstd="t" o:hr="t" fillcolor="#a0a0a0" stroked="f"/>
+          <v:rect id="_x0000_i1035" style="width:0;height:1.5pt" o:hralign="center" o:hrstd="t" o:hr="t" fillcolor="#a0a0a0" stroked="f"/>
         </w:pict>
       </w:r>
     </w:p>
@@ -2902,7 +2906,7 @@
       </w:pPr>
       <w:r>
         <w:rPr>
-          <w:rFonts w:ascii="Arial" w:hAnsi="Arial" w:eastAsia="Arial"/>
+          <w:rFonts w:ascii="Arial" w:eastAsia="Arial" w:hAnsi="Arial"/>
           <w:b/>
           <w:sz w:val="22"/>
           <w:shd w:val="clear" w:color="auto" w:fill="B7B7B7"/>
@@ -2911,7 +2915,7 @@
       </w:r>
       <w:r>
         <w:rPr>
-          <w:rFonts w:ascii="Arial" w:hAnsi="Arial" w:eastAsia="Arial"/>
+          <w:rFonts w:ascii="Arial" w:eastAsia="Arial" w:hAnsi="Arial"/>
           <w:sz w:val="22"/>
           <w:shd w:val="clear" w:color="auto" w:fill="B7B7B7"/>
         </w:rPr>
@@ -2920,7 +2924,7 @@
       <w:proofErr w:type="spellStart"/>
       <w:r>
         <w:rPr>
-          <w:rFonts w:ascii="Arial" w:hAnsi="Arial" w:eastAsia="Arial"/>
+          <w:rFonts w:ascii="Arial" w:eastAsia="Arial" w:hAnsi="Arial"/>
           <w:b/>
           <w:sz w:val="22"/>
           <w:shd w:val="clear" w:color="auto" w:fill="B7B7B7"/>
@@ -2930,7 +2934,7 @@
       <w:proofErr w:type="spellEnd"/>
       <w:r>
         <w:rPr>
-          <w:rFonts w:ascii="Arial" w:hAnsi="Arial" w:eastAsia="Arial"/>
+          <w:rFonts w:ascii="Arial" w:eastAsia="Arial" w:hAnsi="Arial"/>
           <w:b/>
           <w:sz w:val="22"/>
           <w:shd w:val="clear" w:color="auto" w:fill="B7B7B7"/>
@@ -2939,7 +2943,7 @@
       </w:r>
       <w:r>
         <w:rPr>
-          <w:rFonts w:ascii="Arial" w:hAnsi="Arial" w:eastAsia="Arial"/>
+          <w:rFonts w:ascii="Arial" w:eastAsia="Arial" w:hAnsi="Arial"/>
           <w:b/>
           <w:sz w:val="22"/>
           <w:szCs w:val="14"/>
@@ -2949,7 +2953,7 @@
       </w:r>
       <w:r>
         <w:rPr>
-          <w:rFonts w:ascii="Arial" w:hAnsi="Arial" w:cs="Cambria Math" w:eastAsia="Arial"/>
+          <w:rFonts w:ascii="Arial" w:eastAsia="Arial" w:hAnsi="Arial" w:cs="Cambria Math"/>
           <w:b/>
           <w:sz w:val="22"/>
           <w:szCs w:val="14"/>
@@ -2959,7 +2963,7 @@
       </w:r>
       <w:r>
         <w:rPr>
-          <w:rFonts w:ascii="Arial" w:hAnsi="Arial" w:eastAsia="Arial"/>
+          <w:rFonts w:ascii="Arial" w:eastAsia="Arial" w:hAnsi="Arial"/>
           <w:b/>
           <w:sz w:val="22"/>
           <w:szCs w:val="14"/>
@@ -3079,7 +3083,7 @@
           <w:rFonts w:ascii="Roboto Mono" w:hAnsi="Roboto Mono"/>
         </w:rPr>
         <w:pict w14:anchorId="40728EDE">
-          <v:rect id="_x0000_i1257" style="width:0;height:1.5pt" o:hralign="center" o:hrstd="t" o:hr="t" fillcolor="#a0a0a0" stroked="f"/>
+          <v:rect id="_x0000_i1036" style="width:0;height:1.5pt" o:hralign="center" o:hrstd="t" o:hr="t" fillcolor="#a0a0a0" stroked="f"/>
         </w:pict>
       </w:r>
     </w:p>
@@ -3101,7 +3105,7 @@
     <w:p>
       <w:r>
         <w:rPr>
-          <w:rFonts w:ascii="Arial" w:hAnsi="Arial" w:eastAsia="Arial"/>
+          <w:rFonts w:ascii="Arial" w:eastAsia="Arial" w:hAnsi="Arial"/>
           <w:b/>
           <w:sz w:val="22"/>
           <w:shd w:val="clear" w:color="auto" w:fill="B7B7B7"/>
@@ -3110,7 +3114,7 @@
       </w:r>
       <w:r>
         <w:rPr>
-          <w:rFonts w:ascii="Arial" w:hAnsi="Arial" w:eastAsia="Arial"/>
+          <w:rFonts w:ascii="Arial" w:eastAsia="Arial" w:hAnsi="Arial"/>
           <w:sz w:val="22"/>
           <w:shd w:val="clear" w:color="auto" w:fill="B7B7B7"/>
         </w:rPr>
@@ -3119,7 +3123,7 @@
       <w:proofErr w:type="spellStart"/>
       <w:r>
         <w:rPr>
-          <w:rFonts w:ascii="Arial" w:hAnsi="Arial" w:eastAsia="Arial"/>
+          <w:rFonts w:ascii="Arial" w:eastAsia="Arial" w:hAnsi="Arial"/>
           <w:b/>
           <w:sz w:val="22"/>
           <w:shd w:val="clear" w:color="auto" w:fill="B7B7B7"/>
@@ -3129,7 +3133,7 @@
       <w:proofErr w:type="spellEnd"/>
       <w:r>
         <w:rPr>
-          <w:rFonts w:ascii="Arial" w:hAnsi="Arial" w:eastAsia="Arial"/>
+          <w:rFonts w:ascii="Arial" w:eastAsia="Arial" w:hAnsi="Arial"/>
           <w:b/>
           <w:sz w:val="22"/>
           <w:shd w:val="clear" w:color="auto" w:fill="B7B7B7"/>
@@ -3138,7 +3142,7 @@
       </w:r>
       <w:r>
         <w:rPr>
-          <w:rFonts w:ascii="Arial" w:hAnsi="Arial" w:eastAsia="Arial"/>
+          <w:rFonts w:ascii="Arial" w:eastAsia="Arial" w:hAnsi="Arial"/>
           <w:b/>
           <w:sz w:val="22"/>
           <w:szCs w:val="14"/>
@@ -3148,7 +3152,7 @@
       </w:r>
       <w:r>
         <w:rPr>
-          <w:rFonts w:ascii="Arial" w:hAnsi="Arial" w:cs="Cambria Math" w:eastAsia="Arial"/>
+          <w:rFonts w:ascii="Arial" w:eastAsia="Arial" w:hAnsi="Arial" w:cs="Cambria Math"/>
           <w:b/>
           <w:sz w:val="22"/>
           <w:szCs w:val="14"/>
@@ -3158,7 +3162,7 @@
       </w:r>
       <w:r>
         <w:rPr>
-          <w:rFonts w:ascii="Arial" w:hAnsi="Arial" w:eastAsia="Arial"/>
+          <w:rFonts w:ascii="Arial" w:eastAsia="Arial" w:hAnsi="Arial"/>
           <w:b/>
           <w:sz w:val="22"/>
           <w:szCs w:val="14"/>
@@ -3229,7 +3233,7 @@
           <w:rFonts w:ascii="Roboto Mono" w:hAnsi="Roboto Mono"/>
         </w:rPr>
         <w:pict w14:anchorId="05DFB564">
-          <v:rect id="_x0000_i1258" style="width:0;height:1.5pt" o:hralign="center" o:hrstd="t" o:hr="t" fillcolor="#a0a0a0" stroked="f"/>
+          <v:rect id="_x0000_i1037" style="width:0;height:1.5pt" o:hralign="center" o:hrstd="t" o:hr="t" fillcolor="#a0a0a0" stroked="f"/>
         </w:pict>
       </w:r>
     </w:p>
@@ -3255,7 +3259,7 @@
       </w:pPr>
       <w:r>
         <w:rPr>
-          <w:rFonts w:ascii="Arial" w:hAnsi="Arial" w:eastAsia="Arial"/>
+          <w:rFonts w:ascii="Arial" w:eastAsia="Arial" w:hAnsi="Arial"/>
           <w:b/>
           <w:sz w:val="22"/>
           <w:shd w:val="clear" w:color="auto" w:fill="B7B7B7"/>
@@ -3264,7 +3268,7 @@
       </w:r>
       <w:r>
         <w:rPr>
-          <w:rFonts w:ascii="Arial" w:hAnsi="Arial" w:eastAsia="Arial"/>
+          <w:rFonts w:ascii="Arial" w:eastAsia="Arial" w:hAnsi="Arial"/>
           <w:sz w:val="22"/>
           <w:shd w:val="clear" w:color="auto" w:fill="B7B7B7"/>
         </w:rPr>
@@ -3273,7 +3277,7 @@
       <w:proofErr w:type="spellStart"/>
       <w:r>
         <w:rPr>
-          <w:rFonts w:ascii="Arial" w:hAnsi="Arial" w:eastAsia="Arial"/>
+          <w:rFonts w:ascii="Arial" w:eastAsia="Arial" w:hAnsi="Arial"/>
           <w:b/>
           <w:sz w:val="22"/>
           <w:shd w:val="clear" w:color="auto" w:fill="B7B7B7"/>
@@ -3283,7 +3287,7 @@
       <w:proofErr w:type="spellEnd"/>
       <w:r>
         <w:rPr>
-          <w:rFonts w:ascii="Arial" w:hAnsi="Arial" w:eastAsia="Arial"/>
+          <w:rFonts w:ascii="Arial" w:eastAsia="Arial" w:hAnsi="Arial"/>
           <w:b/>
           <w:sz w:val="22"/>
           <w:shd w:val="clear" w:color="auto" w:fill="B7B7B7"/>
@@ -3292,7 +3296,7 @@
       </w:r>
       <w:r>
         <w:rPr>
-          <w:rFonts w:ascii="Arial" w:hAnsi="Arial" w:eastAsia="Arial"/>
+          <w:rFonts w:ascii="Arial" w:eastAsia="Arial" w:hAnsi="Arial"/>
           <w:b/>
           <w:sz w:val="22"/>
           <w:szCs w:val="14"/>
@@ -3302,7 +3306,7 @@
       </w:r>
       <w:r>
         <w:rPr>
-          <w:rFonts w:ascii="Arial" w:hAnsi="Arial" w:cs="Cambria Math" w:eastAsia="Arial"/>
+          <w:rFonts w:ascii="Arial" w:eastAsia="Arial" w:hAnsi="Arial" w:cs="Cambria Math"/>
           <w:b/>
           <w:sz w:val="22"/>
           <w:szCs w:val="14"/>
@@ -3312,7 +3316,7 @@
       </w:r>
       <w:r>
         <w:rPr>
-          <w:rFonts w:ascii="Arial" w:hAnsi="Arial" w:eastAsia="Arial"/>
+          <w:rFonts w:ascii="Arial" w:eastAsia="Arial" w:hAnsi="Arial"/>
           <w:b/>
           <w:sz w:val="22"/>
           <w:szCs w:val="14"/>
@@ -3482,7 +3486,7 @@
           <w:rFonts w:ascii="Roboto Mono" w:hAnsi="Roboto Mono"/>
         </w:rPr>
         <w:pict w14:anchorId="723E6F87">
-          <v:rect id="_x0000_i1259" style="width:0;height:1.5pt" o:hralign="center" o:hrstd="t" o:hr="t" fillcolor="#a0a0a0" stroked="f"/>
+          <v:rect id="_x0000_i1038" style="width:0;height:1.5pt" o:hralign="center" o:hrstd="t" o:hr="t" fillcolor="#a0a0a0" stroked="f"/>
         </w:pict>
       </w:r>
     </w:p>
@@ -3502,7 +3506,7 @@
       </w:pPr>
       <w:r>
         <w:rPr>
-          <w:rFonts w:ascii="Arial" w:hAnsi="Arial" w:eastAsia="Arial"/>
+          <w:rFonts w:ascii="Arial" w:eastAsia="Arial" w:hAnsi="Arial"/>
           <w:b/>
           <w:sz w:val="22"/>
           <w:shd w:val="clear" w:color="auto" w:fill="B7B7B7"/>
@@ -3511,7 +3515,7 @@
       </w:r>
       <w:r>
         <w:rPr>
-          <w:rFonts w:ascii="Arial" w:hAnsi="Arial" w:eastAsia="Arial"/>
+          <w:rFonts w:ascii="Arial" w:eastAsia="Arial" w:hAnsi="Arial"/>
           <w:sz w:val="22"/>
           <w:shd w:val="clear" w:color="auto" w:fill="B7B7B7"/>
         </w:rPr>
@@ -3520,7 +3524,7 @@
       <w:proofErr w:type="spellStart"/>
       <w:r>
         <w:rPr>
-          <w:rFonts w:ascii="Arial" w:hAnsi="Arial" w:eastAsia="Arial"/>
+          <w:rFonts w:ascii="Arial" w:eastAsia="Arial" w:hAnsi="Arial"/>
           <w:b/>
           <w:sz w:val="22"/>
           <w:shd w:val="clear" w:color="auto" w:fill="B7B7B7"/>
@@ -3530,7 +3534,7 @@
       <w:proofErr w:type="spellEnd"/>
       <w:r>
         <w:rPr>
-          <w:rFonts w:ascii="Arial" w:hAnsi="Arial" w:eastAsia="Arial"/>
+          <w:rFonts w:ascii="Arial" w:eastAsia="Arial" w:hAnsi="Arial"/>
           <w:b/>
           <w:sz w:val="22"/>
           <w:shd w:val="clear" w:color="auto" w:fill="B7B7B7"/>
@@ -3539,7 +3543,7 @@
       </w:r>
       <w:r>
         <w:rPr>
-          <w:rFonts w:ascii="Arial" w:hAnsi="Arial" w:eastAsia="Arial"/>
+          <w:rFonts w:ascii="Arial" w:eastAsia="Arial" w:hAnsi="Arial"/>
           <w:b/>
           <w:sz w:val="22"/>
           <w:szCs w:val="14"/>
@@ -3549,7 +3553,7 @@
       </w:r>
       <w:r>
         <w:rPr>
-          <w:rFonts w:ascii="Arial" w:hAnsi="Arial" w:cs="Cambria Math" w:eastAsia="Arial"/>
+          <w:rFonts w:ascii="Arial" w:eastAsia="Arial" w:hAnsi="Arial" w:cs="Cambria Math"/>
           <w:b/>
           <w:sz w:val="22"/>
           <w:szCs w:val="14"/>
@@ -3559,7 +3563,7 @@
       </w:r>
       <w:r>
         <w:rPr>
-          <w:rFonts w:ascii="Arial" w:hAnsi="Arial" w:eastAsia="Arial"/>
+          <w:rFonts w:ascii="Arial" w:eastAsia="Arial" w:hAnsi="Arial"/>
           <w:b/>
           <w:sz w:val="22"/>
           <w:szCs w:val="14"/>
@@ -3567,35 +3571,34 @@
         </w:rPr>
         <w:t>5 Mini) at [12/9/2025]</w:t>
       </w:r>
-      <w:r>
-        <w:rPr>
-          <w:rFonts w:ascii="Arial" w:hAnsi="Arial" w:eastAsia="Arial"/>
-          <w:sz w:val="22"/>
-        </w:rPr>
-        <w:br/>
-        <w:t xml:space="preserve">A computer network links multiple devices to share resources, communicate, and access the internet. Networks can be small or global and use various devices and technologies to send data </w:t>
-      </w:r>
-      <w:r>
-        <w:rPr>
-          <w:rFonts w:ascii="Arial" w:hAnsi="Arial" w:eastAsia="Arial"/>
-          <w:sz w:val="22"/>
+    </w:p>
+    <w:p>
+      <w:pPr>
+        <w:rPr>
+          <w:rFonts w:ascii="Roboto Mono" w:hAnsi="Roboto Mono"/>
+        </w:rPr>
+      </w:pPr>
+      <w:r>
+        <w:rPr>
+          <w:rFonts w:ascii="Roboto Mono" w:eastAsia="Arial" w:hAnsi="Roboto Mono"/>
+          <w:sz w:val="22"/>
+        </w:rPr>
+        <w:t>A computer network links multiple devices to share resources, communicate, and access the internet. Networks can be small or global and use various devices and technologies to send data efficiently. They are essential for modern communication, business, education, and entertainment.</w:t>
+      </w:r>
+    </w:p>
+    <w:p>
+      <w:pPr>
+        <w:rPr>
+          <w:rFonts w:ascii="Roboto Mono" w:hAnsi="Roboto Mono"/>
+        </w:rPr>
+      </w:pPr>
+      <w:r>
+        <w:rPr>
+          <w:rFonts w:ascii="Roboto Mono" w:hAnsi="Roboto Mono"/>
         </w:rPr>
         <w:lastRenderedPageBreak/>
-        <w:t>efficiently. They are essential for modern communication, business, education, and entertainment.</w:t>
-      </w:r>
-    </w:p>
-    <w:p>
-      <w:pPr>
-        <w:rPr>
-          <w:rFonts w:ascii="Roboto Mono" w:hAnsi="Roboto Mono"/>
-        </w:rPr>
-      </w:pPr>
-      <w:r>
-        <w:rPr>
-          <w:rFonts w:ascii="Roboto Mono" w:hAnsi="Roboto Mono"/>
-        </w:rPr>
         <w:pict w14:anchorId="604982B4">
-          <v:rect id="_x0000_i1260" style="width:0;height:1.5pt" o:hralign="center" o:hrstd="t" o:hr="t" fillcolor="#a0a0a0" stroked="f"/>
+          <v:rect id="_x0000_i1039" style="width:0;height:1.5pt" o:hralign="center" o:hrstd="t" o:hr="t" fillcolor="#a0a0a0" stroked="f"/>
         </w:pict>
       </w:r>
     </w:p>
@@ -6009,7 +6012,7 @@
   <w:style w:type="paragraph" w:default="1" w:styleId="Normal">
     <w:name w:val="Normal"/>
     <w:qFormat/>
-    <w:rsid w:val="006B661C"/>
+    <w:rsid w:val="00153E6D"/>
   </w:style>
   <w:style w:type="paragraph" w:styleId="Heading1">
     <w:name w:val="heading 1"/>
@@ -6211,6 +6214,7 @@
   <w:style w:type="character" w:default="1" w:styleId="DefaultParagraphFont">
     <w:name w:val="Default Paragraph Font"/>
     <w:uiPriority w:val="1"/>
+    <w:semiHidden/>
     <w:unhideWhenUsed/>
   </w:style>
   <w:style w:type="table" w:default="1" w:styleId="TableNormal">

</xml_diff>